<commit_message>
feat: 新增 ISP 簽收表製作 v1.3.0
</commit_message>
<xml_diff>
--- a/templates/timetable-template.docx
+++ b/templates/timetable-template.docx
@@ -28,6 +28,13 @@
           <w:sz w:val="24"/>
         </w:rPr>
         <w:t>學號：{studentId}　姓名：{studentName}</w:t>
+      </w:r>
+      <w:r>
+        <w:rPr>
+          <w:rFonts w:ascii="DFKai-SB" w:hAnsi="DFKai-SB" w:eastAsia="標楷體"/>
+          <w:sz w:val="24"/>
+        </w:rPr>
+        <w:t xml:space="preserve">　班級：{studentClass}</w:t>
       </w:r>
     </w:p>
     <w:tbl>

</xml_diff>